<commit_message>
docs(lab5): update reviewer names on report cover
Виконав: Бондаренко Сергій. У блоці «Перевірив» вказано: Дмитро Олегович Чорний; Ілля Володимирович Костевич. Основний текст і схеми звіту без змін.
</commit_message>
<xml_diff>
--- a/docs/Lab5/Report.docx
+++ b/docs/Lab5/Report.docx
@@ -147,7 +147,9 @@
         </w:rPr>
         <w:t>Перевірив:</w:t>
         <w:br/>
-        <w:t>Ігор Косенко</w:t>
+        <w:t>Дмитро Олегович Чорний</w:t>
+        <w:br/>
+        <w:t>Ілля Володимирович Костевич</w:t>
       </w:r>
     </w:p>
     <w:p>

</xml_diff>